<commit_message>
Release 1.1.1 service governance cockpit and dynamic C3 maps
</commit_message>
<xml_diff>
--- a/docs/SC_Admin_Guide_EN.docx
+++ b/docs/SC_Admin_Guide_EN.docx
@@ -78,7 +78,7 @@
           <w:sz w:val="24"/>
           <w:szCs w:val="24"/>
         </w:rPr>
-        <w:t xml:space="preserve">version 1.0</w:t>
+        <w:t>version 1.1.0</w:t>
       </w:r>
     </w:p>
     <w:p>
@@ -93,7 +93,7 @@
           <w:sz w:val="22"/>
           <w:szCs w:val="22"/>
         </w:rPr>
-        <w:t xml:space="preserve">2025</w:t>
+        <w:t>2026</w:t>
       </w:r>
     </w:p>
     <w:p>
@@ -1226,7 +1226,7 @@
           <w:sz w:val="22"/>
           <w:szCs w:val="22"/>
         </w:rPr>
-        <w:t xml:space="preserve">Node.js 20 Alpine — runtime base</w:t>
+        <w:t>Node.js 20.9+ Alpine — runtime base</w:t>
       </w:r>
     </w:p>
     <w:p>
@@ -1262,7 +1262,7 @@
           <w:sz w:val="22"/>
           <w:szCs w:val="22"/>
         </w:rPr>
-        <w:t xml:space="preserve">Next.js 15 (standalone output) — compiled frontend</w:t>
+        <w:t>Next.js 16.2 (standalone output) — compiled frontend</w:t>
       </w:r>
     </w:p>
     <w:p>
@@ -11213,6 +11213,204 @@
         </w:tc>
       </w:tr>
     </w:tbl>
+    <w:p>
+      <w:r>
+        <w:br w:type="page"/>
+      </w:r>
+    </w:p>
+    <w:p>
+      <w:r>
+        <w:rPr>
+          <w:b/>
+        </w:rPr>
+        <w:t>Current application baseline (2026-04-28)</w:t>
+      </w:r>
+    </w:p>
+    <w:tbl>
+      <w:tblPr>
+        <w:tblW w:type="auto" w:w="0"/>
+        <w:tblLook w:firstColumn="1" w:firstRow="1" w:lastColumn="0" w:lastRow="0" w:noHBand="0" w:noVBand="1" w:val="04A0"/>
+      </w:tblPr>
+      <w:tblGrid>
+        <w:gridCol w:w="4513"/>
+        <w:gridCol w:w="4513"/>
+      </w:tblGrid>
+      <w:tr>
+        <w:tc>
+          <w:tcPr>
+            <w:tcW w:type="dxa" w:w="4513"/>
+          </w:tcPr>
+          <w:p>
+            <w:r>
+              <w:t>Area</w:t>
+            </w:r>
+          </w:p>
+        </w:tc>
+        <w:tc>
+          <w:tcPr>
+            <w:tcW w:type="dxa" w:w="4513"/>
+          </w:tcPr>
+          <w:p>
+            <w:r>
+              <w:t>Version baseline</w:t>
+            </w:r>
+          </w:p>
+        </w:tc>
+      </w:tr>
+      <w:tr>
+        <w:tc>
+          <w:tcPr>
+            <w:tcW w:type="dxa" w:w="4513"/>
+          </w:tcPr>
+          <w:p>
+            <w:r>
+              <w:t>Frontend runtime</w:t>
+            </w:r>
+          </w:p>
+        </w:tc>
+        <w:tc>
+          <w:tcPr>
+            <w:tcW w:type="dxa" w:w="4513"/>
+          </w:tcPr>
+          <w:p>
+            <w:r>
+              <w:t>Next.js 16.2.4, React 19.2.5, TypeScript 6.0.3</w:t>
+            </w:r>
+          </w:p>
+        </w:tc>
+      </w:tr>
+      <w:tr>
+        <w:tc>
+          <w:tcPr>
+            <w:tcW w:type="dxa" w:w="4513"/>
+          </w:tcPr>
+          <w:p>
+            <w:r>
+              <w:t>Frontend styling</w:t>
+            </w:r>
+          </w:p>
+        </w:tc>
+        <w:tc>
+          <w:tcPr>
+            <w:tcW w:type="dxa" w:w="4513"/>
+          </w:tcPr>
+          <w:p>
+            <w:r>
+              <w:t>Tailwind CSS 4.2.4, @tailwindcss/postcss 4.2.4, CSS Modules</w:t>
+            </w:r>
+          </w:p>
+        </w:tc>
+      </w:tr>
+      <w:tr>
+        <w:tc>
+          <w:tcPr>
+            <w:tcW w:type="dxa" w:w="4513"/>
+          </w:tcPr>
+          <w:p>
+            <w:r>
+              <w:t>Middleware runtime</w:t>
+            </w:r>
+          </w:p>
+        </w:tc>
+        <w:tc>
+          <w:tcPr>
+            <w:tcW w:type="dxa" w:w="4513"/>
+          </w:tcPr>
+          <w:p>
+            <w:r>
+              <w:t>Express 5.2.1, pg 8.20.0</w:t>
+            </w:r>
+          </w:p>
+        </w:tc>
+      </w:tr>
+      <w:tr>
+        <w:tc>
+          <w:tcPr>
+            <w:tcW w:type="dxa" w:w="4513"/>
+          </w:tcPr>
+          <w:p>
+            <w:r>
+              <w:t>Test tooling</w:t>
+            </w:r>
+          </w:p>
+        </w:tc>
+        <w:tc>
+          <w:tcPr>
+            <w:tcW w:type="dxa" w:w="4513"/>
+          </w:tcPr>
+          <w:p>
+            <w:r>
+              <w:t>Playwright 1.59.1, Jest 30.3.0, Frontend ESLint 9.39.4, Middleware ESLint 10.2.1</w:t>
+            </w:r>
+          </w:p>
+        </w:tc>
+      </w:tr>
+      <w:tr>
+        <w:tc>
+          <w:tcPr>
+            <w:tcW w:type="dxa" w:w="4513"/>
+          </w:tcPr>
+          <w:p>
+            <w:r>
+              <w:t>Package source of truth</w:t>
+            </w:r>
+          </w:p>
+        </w:tc>
+        <w:tc>
+          <w:tcPr>
+            <w:tcW w:type="dxa" w:w="4513"/>
+          </w:tcPr>
+          <w:p>
+            <w:r>
+              <w:t>frontend/package.json, frontend/package-lock.json, middleware/package.json, middleware/package-lock.json</w:t>
+            </w:r>
+          </w:p>
+        </w:tc>
+      </w:tr>
+    </w:tbl>
+    <w:p>
+      <w:r>
+        <w:t>• Keep npm package versions in sync with docs/dependency-baseline.md after every dependency update.</w:t>
+      </w:r>
+    </w:p>
+    <w:p>
+      <w:r>
+        <w:t>• The Help web is available at /help. It is a full help site, not a temporary popup.</w:t>
+      </w:r>
+    </w:p>
+    <w:p>
+      <w:r>
+        <w:t>• Production navigation does not expose the legacy /c3/fmn-air-c2 route; C3 coverage uses the generic capability pages and endpoints.</w:t>
+      </w:r>
+    </w:p>
+    <w:p>
+      <w:r>
+        <w:t>• Governance cockpit outputs include Service Risk Radar, Owner Load Monitor, Contract/Vendor Overlap, and Governance Advisor.</w:t>
+      </w:r>
+    </w:p>
+    <w:p>
+      <w:r>
+        <w:rPr>
+          <w:b/>
+        </w:rPr>
+        <w:t>Help and content governance</w:t>
+      </w:r>
+    </w:p>
+    <w:p>
+      <w:r>
+        <w:t>• Content owner confirms factual correctness, reviewer checks clarity and implemented behavior, approver publishes.</w:t>
+      </w:r>
+    </w:p>
+    <w:p>
+      <w:r>
+        <w:t>• Review Help monthly and after every patch, minor, or major release.</w:t>
+      </w:r>
+    </w:p>
+    <w:p>
+      <w:r>
+        <w:t>• Published documentation must state Documentation version and Compatible application version.</w:t>
+      </w:r>
+    </w:p>
     <w:sectPr>
       <w:headerReference w:type="default" r:id="rId7"/>
       <w:footerReference w:type="default" r:id="rId8"/>

</xml_diff>